<commit_message>
Update report generation to include new options and tables for intensive cost analysis
</commit_message>
<xml_diff>
--- a/Reporte_Crashing.docx
+++ b/Reporte_Crashing.docx
@@ -30,7 +30,7 @@
         <w:rPr>
           <w:i/>
         </w:rPr>
-        <w:t>Fecha: 01/05/2026</w:t>
+        <w:t>Fecha: 04/05/2026</w:t>
       </w:r>
     </w:p>
     <w:p>
@@ -8721,10 +8721,2364 @@
     <w:p/>
     <w:p>
       <w:pPr>
+        <w:pStyle w:val="Heading2"/>
+      </w:pPr>
+      <w:r>
+        <w:t>Opción (b) — Tint con costo intensivo MÁXIMO</w:t>
+      </w:r>
+    </w:p>
+    <w:p>
+      <w:pPr>
         <w:pStyle w:val="Heading3"/>
       </w:pPr>
       <w:r>
-        <w:t>Caminos con tiempos óptimos sugeridos (opción c)</w:t>
+        <w:t>Caminos con tiempos intensivos (opción b)</w:t>
+      </w:r>
+    </w:p>
+    <w:tbl>
+      <w:tblPr>
+        <w:tblStyle w:val="LightGrid-Accent1"/>
+        <w:tblW w:type="auto" w:w="0"/>
+        <w:tblLook w:firstColumn="1" w:firstRow="1" w:lastColumn="0" w:lastRow="0" w:noHBand="0" w:noVBand="1" w:val="04A0"/>
+      </w:tblPr>
+      <w:tblGrid>
+        <w:gridCol w:w="2160"/>
+        <w:gridCol w:w="2160"/>
+        <w:gridCol w:w="2160"/>
+        <w:gridCol w:w="2160"/>
+      </w:tblGrid>
+      <w:tr>
+        <w:tc>
+          <w:tcPr>
+            <w:tcW w:type="dxa" w:w="2160"/>
+            <w:vAlign w:val="center"/>
+          </w:tcPr>
+          <w:p>
+            <w:r/>
+            <w:r>
+              <w:rPr>
+                <w:b/>
+                <w:sz w:val="20"/>
+              </w:rPr>
+              <w:t>#</w:t>
+            </w:r>
+          </w:p>
+        </w:tc>
+        <w:tc>
+          <w:tcPr>
+            <w:tcW w:type="dxa" w:w="2160"/>
+            <w:vAlign w:val="center"/>
+          </w:tcPr>
+          <w:p>
+            <w:r/>
+            <w:r>
+              <w:rPr>
+                <w:b/>
+                <w:sz w:val="20"/>
+              </w:rPr>
+              <w:t>Duración del Camino</w:t>
+            </w:r>
+          </w:p>
+        </w:tc>
+        <w:tc>
+          <w:tcPr>
+            <w:tcW w:type="dxa" w:w="2160"/>
+            <w:vAlign w:val="center"/>
+          </w:tcPr>
+          <w:p>
+            <w:r/>
+            <w:r>
+              <w:rPr>
+                <w:b/>
+                <w:sz w:val="20"/>
+              </w:rPr>
+              <w:t>Holgura del Camino</w:t>
+            </w:r>
+          </w:p>
+        </w:tc>
+        <w:tc>
+          <w:tcPr>
+            <w:tcW w:type="dxa" w:w="2160"/>
+            <w:vAlign w:val="center"/>
+          </w:tcPr>
+          <w:p>
+            <w:r/>
+            <w:r>
+              <w:rPr>
+                <w:b/>
+                <w:sz w:val="20"/>
+              </w:rPr>
+              <w:t>Camino</w:t>
+            </w:r>
+          </w:p>
+        </w:tc>
+      </w:tr>
+      <w:tr>
+        <w:tc>
+          <w:tcPr>
+            <w:tcW w:type="dxa" w:w="2160"/>
+          </w:tcPr>
+          <w:p>
+            <w:r/>
+            <w:r>
+              <w:rPr>
+                <w:b/>
+                <w:color w:val="C0504D"/>
+                <w:sz w:val="20"/>
+              </w:rPr>
+              <w:t>1</w:t>
+            </w:r>
+          </w:p>
+        </w:tc>
+        <w:tc>
+          <w:tcPr>
+            <w:tcW w:type="dxa" w:w="2160"/>
+          </w:tcPr>
+          <w:p>
+            <w:r/>
+            <w:r>
+              <w:rPr>
+                <w:b/>
+                <w:color w:val="C0504D"/>
+                <w:sz w:val="20"/>
+              </w:rPr>
+              <w:t>73</w:t>
+            </w:r>
+          </w:p>
+        </w:tc>
+        <w:tc>
+          <w:tcPr>
+            <w:tcW w:type="dxa" w:w="2160"/>
+          </w:tcPr>
+          <w:p>
+            <w:r/>
+            <w:r>
+              <w:rPr>
+                <w:b/>
+                <w:color w:val="C0504D"/>
+                <w:sz w:val="20"/>
+              </w:rPr>
+              <w:t>0</w:t>
+            </w:r>
+          </w:p>
+        </w:tc>
+        <w:tc>
+          <w:tcPr>
+            <w:tcW w:type="dxa" w:w="2160"/>
+          </w:tcPr>
+          <w:p>
+            <w:r/>
+            <w:r>
+              <w:rPr>
+                <w:b/>
+                <w:color w:val="C0504D"/>
+                <w:sz w:val="20"/>
+              </w:rPr>
+              <w:t>A(4) → C(7) → D(6) → G(10) → H(14) → I(12) → J(14) → L(6)</w:t>
+            </w:r>
+          </w:p>
+        </w:tc>
+      </w:tr>
+      <w:tr>
+        <w:tc>
+          <w:tcPr>
+            <w:tcW w:type="dxa" w:w="2160"/>
+          </w:tcPr>
+          <w:p>
+            <w:r/>
+            <w:r>
+              <w:rPr>
+                <w:sz w:val="20"/>
+              </w:rPr>
+              <w:t>2</w:t>
+            </w:r>
+          </w:p>
+        </w:tc>
+        <w:tc>
+          <w:tcPr>
+            <w:tcW w:type="dxa" w:w="2160"/>
+          </w:tcPr>
+          <w:p>
+            <w:r/>
+            <w:r>
+              <w:rPr>
+                <w:sz w:val="20"/>
+              </w:rPr>
+              <w:t>72</w:t>
+            </w:r>
+          </w:p>
+        </w:tc>
+        <w:tc>
+          <w:tcPr>
+            <w:tcW w:type="dxa" w:w="2160"/>
+          </w:tcPr>
+          <w:p>
+            <w:r/>
+            <w:r>
+              <w:rPr>
+                <w:sz w:val="20"/>
+              </w:rPr>
+              <w:t>1</w:t>
+            </w:r>
+          </w:p>
+        </w:tc>
+        <w:tc>
+          <w:tcPr>
+            <w:tcW w:type="dxa" w:w="2160"/>
+          </w:tcPr>
+          <w:p>
+            <w:r/>
+            <w:r>
+              <w:rPr>
+                <w:sz w:val="20"/>
+              </w:rPr>
+              <w:t>A(4) → B(6) → D(6) → G(10) → H(14) → I(12) → J(14) → L(6)</w:t>
+            </w:r>
+          </w:p>
+        </w:tc>
+      </w:tr>
+      <w:tr>
+        <w:tc>
+          <w:tcPr>
+            <w:tcW w:type="dxa" w:w="2160"/>
+          </w:tcPr>
+          <w:p>
+            <w:r/>
+            <w:r>
+              <w:rPr>
+                <w:sz w:val="20"/>
+              </w:rPr>
+              <w:t>3</w:t>
+            </w:r>
+          </w:p>
+        </w:tc>
+        <w:tc>
+          <w:tcPr>
+            <w:tcW w:type="dxa" w:w="2160"/>
+          </w:tcPr>
+          <w:p>
+            <w:r/>
+            <w:r>
+              <w:rPr>
+                <w:sz w:val="20"/>
+              </w:rPr>
+              <w:t>65</w:t>
+            </w:r>
+          </w:p>
+        </w:tc>
+        <w:tc>
+          <w:tcPr>
+            <w:tcW w:type="dxa" w:w="2160"/>
+          </w:tcPr>
+          <w:p>
+            <w:r/>
+            <w:r>
+              <w:rPr>
+                <w:sz w:val="20"/>
+              </w:rPr>
+              <w:t>8</w:t>
+            </w:r>
+          </w:p>
+        </w:tc>
+        <w:tc>
+          <w:tcPr>
+            <w:tcW w:type="dxa" w:w="2160"/>
+          </w:tcPr>
+          <w:p>
+            <w:r/>
+            <w:r>
+              <w:rPr>
+                <w:sz w:val="20"/>
+              </w:rPr>
+              <w:t>A(4) → C(7) → D(6) → G(10) → H(14) → I(12) → K(6) → L(6)</w:t>
+            </w:r>
+          </w:p>
+        </w:tc>
+      </w:tr>
+      <w:tr>
+        <w:tc>
+          <w:tcPr>
+            <w:tcW w:type="dxa" w:w="2160"/>
+          </w:tcPr>
+          <w:p>
+            <w:r/>
+            <w:r>
+              <w:rPr>
+                <w:sz w:val="20"/>
+              </w:rPr>
+              <w:t>4</w:t>
+            </w:r>
+          </w:p>
+        </w:tc>
+        <w:tc>
+          <w:tcPr>
+            <w:tcW w:type="dxa" w:w="2160"/>
+          </w:tcPr>
+          <w:p>
+            <w:r/>
+            <w:r>
+              <w:rPr>
+                <w:sz w:val="20"/>
+              </w:rPr>
+              <w:t>64</w:t>
+            </w:r>
+          </w:p>
+        </w:tc>
+        <w:tc>
+          <w:tcPr>
+            <w:tcW w:type="dxa" w:w="2160"/>
+          </w:tcPr>
+          <w:p>
+            <w:r/>
+            <w:r>
+              <w:rPr>
+                <w:sz w:val="20"/>
+              </w:rPr>
+              <w:t>9</w:t>
+            </w:r>
+          </w:p>
+        </w:tc>
+        <w:tc>
+          <w:tcPr>
+            <w:tcW w:type="dxa" w:w="2160"/>
+          </w:tcPr>
+          <w:p>
+            <w:r/>
+            <w:r>
+              <w:rPr>
+                <w:sz w:val="20"/>
+              </w:rPr>
+              <w:t>A(4) → B(6) → D(6) → G(10) → H(14) → I(12) → K(6) → L(6)</w:t>
+            </w:r>
+          </w:p>
+        </w:tc>
+      </w:tr>
+      <w:tr>
+        <w:tc>
+          <w:tcPr>
+            <w:tcW w:type="dxa" w:w="2160"/>
+          </w:tcPr>
+          <w:p>
+            <w:r/>
+            <w:r>
+              <w:rPr>
+                <w:sz w:val="20"/>
+              </w:rPr>
+              <w:t>5</w:t>
+            </w:r>
+          </w:p>
+        </w:tc>
+        <w:tc>
+          <w:tcPr>
+            <w:tcW w:type="dxa" w:w="2160"/>
+          </w:tcPr>
+          <w:p>
+            <w:r/>
+            <w:r>
+              <w:rPr>
+                <w:sz w:val="20"/>
+              </w:rPr>
+              <w:t>57</w:t>
+            </w:r>
+          </w:p>
+        </w:tc>
+        <w:tc>
+          <w:tcPr>
+            <w:tcW w:type="dxa" w:w="2160"/>
+          </w:tcPr>
+          <w:p>
+            <w:r/>
+            <w:r>
+              <w:rPr>
+                <w:sz w:val="20"/>
+              </w:rPr>
+              <w:t>16</w:t>
+            </w:r>
+          </w:p>
+        </w:tc>
+        <w:tc>
+          <w:tcPr>
+            <w:tcW w:type="dxa" w:w="2160"/>
+          </w:tcPr>
+          <w:p>
+            <w:r/>
+            <w:r>
+              <w:rPr>
+                <w:sz w:val="20"/>
+              </w:rPr>
+              <w:t>A(4) → C(7) → D(6) → F(8) → I(12) → J(14) → L(6)</w:t>
+            </w:r>
+          </w:p>
+        </w:tc>
+      </w:tr>
+      <w:tr>
+        <w:tc>
+          <w:tcPr>
+            <w:tcW w:type="dxa" w:w="2160"/>
+          </w:tcPr>
+          <w:p>
+            <w:r/>
+            <w:r>
+              <w:rPr>
+                <w:sz w:val="20"/>
+              </w:rPr>
+              <w:t>6</w:t>
+            </w:r>
+          </w:p>
+        </w:tc>
+        <w:tc>
+          <w:tcPr>
+            <w:tcW w:type="dxa" w:w="2160"/>
+          </w:tcPr>
+          <w:p>
+            <w:r/>
+            <w:r>
+              <w:rPr>
+                <w:sz w:val="20"/>
+              </w:rPr>
+              <w:t>56</w:t>
+            </w:r>
+          </w:p>
+        </w:tc>
+        <w:tc>
+          <w:tcPr>
+            <w:tcW w:type="dxa" w:w="2160"/>
+          </w:tcPr>
+          <w:p>
+            <w:r/>
+            <w:r>
+              <w:rPr>
+                <w:sz w:val="20"/>
+              </w:rPr>
+              <w:t>17</w:t>
+            </w:r>
+          </w:p>
+        </w:tc>
+        <w:tc>
+          <w:tcPr>
+            <w:tcW w:type="dxa" w:w="2160"/>
+          </w:tcPr>
+          <w:p>
+            <w:r/>
+            <w:r>
+              <w:rPr>
+                <w:sz w:val="20"/>
+              </w:rPr>
+              <w:t>A(4) → B(6) → D(6) → F(8) → I(12) → J(14) → L(6)</w:t>
+            </w:r>
+          </w:p>
+        </w:tc>
+      </w:tr>
+      <w:tr>
+        <w:tc>
+          <w:tcPr>
+            <w:tcW w:type="dxa" w:w="2160"/>
+          </w:tcPr>
+          <w:p>
+            <w:r/>
+            <w:r>
+              <w:rPr>
+                <w:sz w:val="20"/>
+              </w:rPr>
+              <w:t>7</w:t>
+            </w:r>
+          </w:p>
+        </w:tc>
+        <w:tc>
+          <w:tcPr>
+            <w:tcW w:type="dxa" w:w="2160"/>
+          </w:tcPr>
+          <w:p>
+            <w:r/>
+            <w:r>
+              <w:rPr>
+                <w:sz w:val="20"/>
+              </w:rPr>
+              <w:t>49</w:t>
+            </w:r>
+          </w:p>
+        </w:tc>
+        <w:tc>
+          <w:tcPr>
+            <w:tcW w:type="dxa" w:w="2160"/>
+          </w:tcPr>
+          <w:p>
+            <w:r/>
+            <w:r>
+              <w:rPr>
+                <w:sz w:val="20"/>
+              </w:rPr>
+              <w:t>24</w:t>
+            </w:r>
+          </w:p>
+        </w:tc>
+        <w:tc>
+          <w:tcPr>
+            <w:tcW w:type="dxa" w:w="2160"/>
+          </w:tcPr>
+          <w:p>
+            <w:r/>
+            <w:r>
+              <w:rPr>
+                <w:sz w:val="20"/>
+              </w:rPr>
+              <w:t>A(4) → C(7) → D(6) → F(8) → I(12) → K(6) → L(6)</w:t>
+            </w:r>
+          </w:p>
+        </w:tc>
+      </w:tr>
+      <w:tr>
+        <w:tc>
+          <w:tcPr>
+            <w:tcW w:type="dxa" w:w="2160"/>
+          </w:tcPr>
+          <w:p>
+            <w:r/>
+            <w:r>
+              <w:rPr>
+                <w:sz w:val="20"/>
+              </w:rPr>
+              <w:t>8</w:t>
+            </w:r>
+          </w:p>
+        </w:tc>
+        <w:tc>
+          <w:tcPr>
+            <w:tcW w:type="dxa" w:w="2160"/>
+          </w:tcPr>
+          <w:p>
+            <w:r/>
+            <w:r>
+              <w:rPr>
+                <w:sz w:val="20"/>
+              </w:rPr>
+              <w:t>48</w:t>
+            </w:r>
+          </w:p>
+        </w:tc>
+        <w:tc>
+          <w:tcPr>
+            <w:tcW w:type="dxa" w:w="2160"/>
+          </w:tcPr>
+          <w:p>
+            <w:r/>
+            <w:r>
+              <w:rPr>
+                <w:sz w:val="20"/>
+              </w:rPr>
+              <w:t>25</w:t>
+            </w:r>
+          </w:p>
+        </w:tc>
+        <w:tc>
+          <w:tcPr>
+            <w:tcW w:type="dxa" w:w="2160"/>
+          </w:tcPr>
+          <w:p>
+            <w:r/>
+            <w:r>
+              <w:rPr>
+                <w:sz w:val="20"/>
+              </w:rPr>
+              <w:t>A(4) → B(6) → D(6) → F(8) → I(12) → K(6) → L(6)</w:t>
+            </w:r>
+          </w:p>
+        </w:tc>
+      </w:tr>
+      <w:tr>
+        <w:tc>
+          <w:tcPr>
+            <w:tcW w:type="dxa" w:w="2160"/>
+          </w:tcPr>
+          <w:p>
+            <w:r/>
+            <w:r>
+              <w:rPr>
+                <w:sz w:val="20"/>
+              </w:rPr>
+              <w:t>9</w:t>
+            </w:r>
+          </w:p>
+        </w:tc>
+        <w:tc>
+          <w:tcPr>
+            <w:tcW w:type="dxa" w:w="2160"/>
+          </w:tcPr>
+          <w:p>
+            <w:r/>
+            <w:r>
+              <w:rPr>
+                <w:sz w:val="20"/>
+              </w:rPr>
+              <w:t>30</w:t>
+            </w:r>
+          </w:p>
+        </w:tc>
+        <w:tc>
+          <w:tcPr>
+            <w:tcW w:type="dxa" w:w="2160"/>
+          </w:tcPr>
+          <w:p>
+            <w:r/>
+            <w:r>
+              <w:rPr>
+                <w:sz w:val="20"/>
+              </w:rPr>
+              <w:t>43</w:t>
+            </w:r>
+          </w:p>
+        </w:tc>
+        <w:tc>
+          <w:tcPr>
+            <w:tcW w:type="dxa" w:w="2160"/>
+          </w:tcPr>
+          <w:p>
+            <w:r/>
+            <w:r>
+              <w:rPr>
+                <w:sz w:val="20"/>
+              </w:rPr>
+              <w:t>A(4) → C(7) → D(6) → E(7) → L(6)</w:t>
+            </w:r>
+          </w:p>
+        </w:tc>
+      </w:tr>
+      <w:tr>
+        <w:tc>
+          <w:tcPr>
+            <w:tcW w:type="dxa" w:w="2160"/>
+          </w:tcPr>
+          <w:p>
+            <w:r/>
+            <w:r>
+              <w:rPr>
+                <w:sz w:val="20"/>
+              </w:rPr>
+              <w:t>10</w:t>
+            </w:r>
+          </w:p>
+        </w:tc>
+        <w:tc>
+          <w:tcPr>
+            <w:tcW w:type="dxa" w:w="2160"/>
+          </w:tcPr>
+          <w:p>
+            <w:r/>
+            <w:r>
+              <w:rPr>
+                <w:sz w:val="20"/>
+              </w:rPr>
+              <w:t>29</w:t>
+            </w:r>
+          </w:p>
+        </w:tc>
+        <w:tc>
+          <w:tcPr>
+            <w:tcW w:type="dxa" w:w="2160"/>
+          </w:tcPr>
+          <w:p>
+            <w:r/>
+            <w:r>
+              <w:rPr>
+                <w:sz w:val="20"/>
+              </w:rPr>
+              <w:t>44</w:t>
+            </w:r>
+          </w:p>
+        </w:tc>
+        <w:tc>
+          <w:tcPr>
+            <w:tcW w:type="dxa" w:w="2160"/>
+          </w:tcPr>
+          <w:p>
+            <w:r/>
+            <w:r>
+              <w:rPr>
+                <w:sz w:val="20"/>
+              </w:rPr>
+              <w:t>A(4) → B(6) → D(6) → E(7) → L(6)</w:t>
+            </w:r>
+          </w:p>
+        </w:tc>
+      </w:tr>
+    </w:tbl>
+    <w:p>
+      <w:r>
+        <w:rPr>
+          <w:b/>
+          <w:i w:val="0"/>
+        </w:rPr>
+        <w:t>Duración de la ruta crítica: 73 días.   Ruta(s) crítica(s): A → C → D → G → H → I → J → L</w:t>
+      </w:r>
+    </w:p>
+    <w:p/>
+    <w:p>
+      <w:pPr>
+        <w:pStyle w:val="Heading3"/>
+      </w:pPr>
+      <w:r>
+        <w:t>Tabla de holguras por actividad — tiempos intensivos, costo máximo (opción b)</w:t>
+      </w:r>
+    </w:p>
+    <w:tbl>
+      <w:tblPr>
+        <w:tblStyle w:val="LightGrid-Accent1"/>
+        <w:tblW w:type="auto" w:w="0"/>
+        <w:tblLook w:firstColumn="1" w:firstRow="1" w:lastColumn="0" w:lastRow="0" w:noHBand="0" w:noVBand="1" w:val="04A0"/>
+      </w:tblPr>
+      <w:tblGrid>
+        <w:gridCol w:w="1080"/>
+        <w:gridCol w:w="1080"/>
+        <w:gridCol w:w="1080"/>
+        <w:gridCol w:w="1080"/>
+        <w:gridCol w:w="1080"/>
+        <w:gridCol w:w="1080"/>
+        <w:gridCol w:w="1080"/>
+        <w:gridCol w:w="1080"/>
+      </w:tblGrid>
+      <w:tr>
+        <w:tc>
+          <w:tcPr>
+            <w:tcW w:type="dxa" w:w="1080"/>
+            <w:vAlign w:val="center"/>
+          </w:tcPr>
+          <w:p>
+            <w:r/>
+            <w:r>
+              <w:rPr>
+                <w:b/>
+                <w:sz w:val="20"/>
+              </w:rPr>
+              <w:t>Actividad</w:t>
+            </w:r>
+          </w:p>
+        </w:tc>
+        <w:tc>
+          <w:tcPr>
+            <w:tcW w:type="dxa" w:w="1080"/>
+            <w:vAlign w:val="center"/>
+          </w:tcPr>
+          <w:p>
+            <w:r/>
+            <w:r>
+              <w:rPr>
+                <w:b/>
+                <w:sz w:val="20"/>
+              </w:rPr>
+              <w:t>Duración</w:t>
+            </w:r>
+          </w:p>
+        </w:tc>
+        <w:tc>
+          <w:tcPr>
+            <w:tcW w:type="dxa" w:w="1080"/>
+            <w:vAlign w:val="center"/>
+          </w:tcPr>
+          <w:p>
+            <w:r/>
+            <w:r>
+              <w:rPr>
+                <w:b/>
+                <w:sz w:val="20"/>
+              </w:rPr>
+              <w:t>Inicio Cercano</w:t>
+            </w:r>
+          </w:p>
+        </w:tc>
+        <w:tc>
+          <w:tcPr>
+            <w:tcW w:type="dxa" w:w="1080"/>
+            <w:vAlign w:val="center"/>
+          </w:tcPr>
+          <w:p>
+            <w:r/>
+            <w:r>
+              <w:rPr>
+                <w:b/>
+                <w:sz w:val="20"/>
+              </w:rPr>
+              <w:t>Término Cercano</w:t>
+            </w:r>
+          </w:p>
+        </w:tc>
+        <w:tc>
+          <w:tcPr>
+            <w:tcW w:type="dxa" w:w="1080"/>
+            <w:vAlign w:val="center"/>
+          </w:tcPr>
+          <w:p>
+            <w:r/>
+            <w:r>
+              <w:rPr>
+                <w:b/>
+                <w:sz w:val="20"/>
+              </w:rPr>
+              <w:t>Inicio Lejano</w:t>
+            </w:r>
+          </w:p>
+        </w:tc>
+        <w:tc>
+          <w:tcPr>
+            <w:tcW w:type="dxa" w:w="1080"/>
+            <w:vAlign w:val="center"/>
+          </w:tcPr>
+          <w:p>
+            <w:r/>
+            <w:r>
+              <w:rPr>
+                <w:b/>
+                <w:sz w:val="20"/>
+              </w:rPr>
+              <w:t>Término Lejano</w:t>
+            </w:r>
+          </w:p>
+        </w:tc>
+        <w:tc>
+          <w:tcPr>
+            <w:tcW w:type="dxa" w:w="1080"/>
+            <w:vAlign w:val="center"/>
+          </w:tcPr>
+          <w:p>
+            <w:r/>
+            <w:r>
+              <w:rPr>
+                <w:b/>
+                <w:sz w:val="20"/>
+              </w:rPr>
+              <w:t>Holgura Total</w:t>
+            </w:r>
+          </w:p>
+        </w:tc>
+        <w:tc>
+          <w:tcPr>
+            <w:tcW w:type="dxa" w:w="1080"/>
+            <w:vAlign w:val="center"/>
+          </w:tcPr>
+          <w:p>
+            <w:r/>
+            <w:r>
+              <w:rPr>
+                <w:b/>
+                <w:sz w:val="20"/>
+              </w:rPr>
+              <w:t>¿Crítica?</w:t>
+            </w:r>
+          </w:p>
+        </w:tc>
+      </w:tr>
+      <w:tr>
+        <w:tc>
+          <w:tcPr>
+            <w:tcW w:type="dxa" w:w="1080"/>
+          </w:tcPr>
+          <w:p>
+            <w:r/>
+            <w:r>
+              <w:rPr>
+                <w:b/>
+                <w:color w:val="C0504D"/>
+                <w:sz w:val="20"/>
+              </w:rPr>
+              <w:t>A</w:t>
+            </w:r>
+          </w:p>
+        </w:tc>
+        <w:tc>
+          <w:tcPr>
+            <w:tcW w:type="dxa" w:w="1080"/>
+          </w:tcPr>
+          <w:p>
+            <w:r/>
+            <w:r>
+              <w:rPr>
+                <w:b/>
+                <w:color w:val="C0504D"/>
+                <w:sz w:val="20"/>
+              </w:rPr>
+              <w:t>4</w:t>
+            </w:r>
+          </w:p>
+        </w:tc>
+        <w:tc>
+          <w:tcPr>
+            <w:tcW w:type="dxa" w:w="1080"/>
+          </w:tcPr>
+          <w:p>
+            <w:r/>
+            <w:r>
+              <w:rPr>
+                <w:b/>
+                <w:color w:val="C0504D"/>
+                <w:sz w:val="20"/>
+              </w:rPr>
+              <w:t>0</w:t>
+            </w:r>
+          </w:p>
+        </w:tc>
+        <w:tc>
+          <w:tcPr>
+            <w:tcW w:type="dxa" w:w="1080"/>
+          </w:tcPr>
+          <w:p>
+            <w:r/>
+            <w:r>
+              <w:rPr>
+                <w:b/>
+                <w:color w:val="C0504D"/>
+                <w:sz w:val="20"/>
+              </w:rPr>
+              <w:t>4</w:t>
+            </w:r>
+          </w:p>
+        </w:tc>
+        <w:tc>
+          <w:tcPr>
+            <w:tcW w:type="dxa" w:w="1080"/>
+          </w:tcPr>
+          <w:p>
+            <w:r/>
+            <w:r>
+              <w:rPr>
+                <w:b/>
+                <w:color w:val="C0504D"/>
+                <w:sz w:val="20"/>
+              </w:rPr>
+              <w:t>0</w:t>
+            </w:r>
+          </w:p>
+        </w:tc>
+        <w:tc>
+          <w:tcPr>
+            <w:tcW w:type="dxa" w:w="1080"/>
+          </w:tcPr>
+          <w:p>
+            <w:r/>
+            <w:r>
+              <w:rPr>
+                <w:b/>
+                <w:color w:val="C0504D"/>
+                <w:sz w:val="20"/>
+              </w:rPr>
+              <w:t>4</w:t>
+            </w:r>
+          </w:p>
+        </w:tc>
+        <w:tc>
+          <w:tcPr>
+            <w:tcW w:type="dxa" w:w="1080"/>
+          </w:tcPr>
+          <w:p>
+            <w:r/>
+            <w:r>
+              <w:rPr>
+                <w:b/>
+                <w:color w:val="C0504D"/>
+                <w:sz w:val="20"/>
+              </w:rPr>
+              <w:t>0</w:t>
+            </w:r>
+          </w:p>
+        </w:tc>
+        <w:tc>
+          <w:tcPr>
+            <w:tcW w:type="dxa" w:w="1080"/>
+          </w:tcPr>
+          <w:p>
+            <w:r/>
+            <w:r>
+              <w:rPr>
+                <w:b/>
+                <w:color w:val="C0504D"/>
+                <w:sz w:val="20"/>
+              </w:rPr>
+              <w:t>SÍ</w:t>
+            </w:r>
+          </w:p>
+        </w:tc>
+      </w:tr>
+      <w:tr>
+        <w:tc>
+          <w:tcPr>
+            <w:tcW w:type="dxa" w:w="1080"/>
+          </w:tcPr>
+          <w:p>
+            <w:r/>
+            <w:r>
+              <w:rPr>
+                <w:sz w:val="20"/>
+              </w:rPr>
+              <w:t>B</w:t>
+            </w:r>
+          </w:p>
+        </w:tc>
+        <w:tc>
+          <w:tcPr>
+            <w:tcW w:type="dxa" w:w="1080"/>
+          </w:tcPr>
+          <w:p>
+            <w:r/>
+            <w:r>
+              <w:rPr>
+                <w:sz w:val="20"/>
+              </w:rPr>
+              <w:t>6</w:t>
+            </w:r>
+          </w:p>
+        </w:tc>
+        <w:tc>
+          <w:tcPr>
+            <w:tcW w:type="dxa" w:w="1080"/>
+          </w:tcPr>
+          <w:p>
+            <w:r/>
+            <w:r>
+              <w:rPr>
+                <w:sz w:val="20"/>
+              </w:rPr>
+              <w:t>4</w:t>
+            </w:r>
+          </w:p>
+        </w:tc>
+        <w:tc>
+          <w:tcPr>
+            <w:tcW w:type="dxa" w:w="1080"/>
+          </w:tcPr>
+          <w:p>
+            <w:r/>
+            <w:r>
+              <w:rPr>
+                <w:sz w:val="20"/>
+              </w:rPr>
+              <w:t>10</w:t>
+            </w:r>
+          </w:p>
+        </w:tc>
+        <w:tc>
+          <w:tcPr>
+            <w:tcW w:type="dxa" w:w="1080"/>
+          </w:tcPr>
+          <w:p>
+            <w:r/>
+            <w:r>
+              <w:rPr>
+                <w:sz w:val="20"/>
+              </w:rPr>
+              <w:t>5</w:t>
+            </w:r>
+          </w:p>
+        </w:tc>
+        <w:tc>
+          <w:tcPr>
+            <w:tcW w:type="dxa" w:w="1080"/>
+          </w:tcPr>
+          <w:p>
+            <w:r/>
+            <w:r>
+              <w:rPr>
+                <w:sz w:val="20"/>
+              </w:rPr>
+              <w:t>11</w:t>
+            </w:r>
+          </w:p>
+        </w:tc>
+        <w:tc>
+          <w:tcPr>
+            <w:tcW w:type="dxa" w:w="1080"/>
+          </w:tcPr>
+          <w:p>
+            <w:r/>
+            <w:r>
+              <w:rPr>
+                <w:sz w:val="20"/>
+              </w:rPr>
+              <w:t>1</w:t>
+            </w:r>
+          </w:p>
+        </w:tc>
+        <w:tc>
+          <w:tcPr>
+            <w:tcW w:type="dxa" w:w="1080"/>
+          </w:tcPr>
+          <w:p>
+            <w:r/>
+            <w:r>
+              <w:rPr>
+                <w:sz w:val="20"/>
+              </w:rPr>
+              <w:t>No</w:t>
+            </w:r>
+          </w:p>
+        </w:tc>
+      </w:tr>
+      <w:tr>
+        <w:tc>
+          <w:tcPr>
+            <w:tcW w:type="dxa" w:w="1080"/>
+          </w:tcPr>
+          <w:p>
+            <w:r/>
+            <w:r>
+              <w:rPr>
+                <w:b/>
+                <w:color w:val="C0504D"/>
+                <w:sz w:val="20"/>
+              </w:rPr>
+              <w:t>C</w:t>
+            </w:r>
+          </w:p>
+        </w:tc>
+        <w:tc>
+          <w:tcPr>
+            <w:tcW w:type="dxa" w:w="1080"/>
+          </w:tcPr>
+          <w:p>
+            <w:r/>
+            <w:r>
+              <w:rPr>
+                <w:b/>
+                <w:color w:val="C0504D"/>
+                <w:sz w:val="20"/>
+              </w:rPr>
+              <w:t>7</w:t>
+            </w:r>
+          </w:p>
+        </w:tc>
+        <w:tc>
+          <w:tcPr>
+            <w:tcW w:type="dxa" w:w="1080"/>
+          </w:tcPr>
+          <w:p>
+            <w:r/>
+            <w:r>
+              <w:rPr>
+                <w:b/>
+                <w:color w:val="C0504D"/>
+                <w:sz w:val="20"/>
+              </w:rPr>
+              <w:t>4</w:t>
+            </w:r>
+          </w:p>
+        </w:tc>
+        <w:tc>
+          <w:tcPr>
+            <w:tcW w:type="dxa" w:w="1080"/>
+          </w:tcPr>
+          <w:p>
+            <w:r/>
+            <w:r>
+              <w:rPr>
+                <w:b/>
+                <w:color w:val="C0504D"/>
+                <w:sz w:val="20"/>
+              </w:rPr>
+              <w:t>11</w:t>
+            </w:r>
+          </w:p>
+        </w:tc>
+        <w:tc>
+          <w:tcPr>
+            <w:tcW w:type="dxa" w:w="1080"/>
+          </w:tcPr>
+          <w:p>
+            <w:r/>
+            <w:r>
+              <w:rPr>
+                <w:b/>
+                <w:color w:val="C0504D"/>
+                <w:sz w:val="20"/>
+              </w:rPr>
+              <w:t>4</w:t>
+            </w:r>
+          </w:p>
+        </w:tc>
+        <w:tc>
+          <w:tcPr>
+            <w:tcW w:type="dxa" w:w="1080"/>
+          </w:tcPr>
+          <w:p>
+            <w:r/>
+            <w:r>
+              <w:rPr>
+                <w:b/>
+                <w:color w:val="C0504D"/>
+                <w:sz w:val="20"/>
+              </w:rPr>
+              <w:t>11</w:t>
+            </w:r>
+          </w:p>
+        </w:tc>
+        <w:tc>
+          <w:tcPr>
+            <w:tcW w:type="dxa" w:w="1080"/>
+          </w:tcPr>
+          <w:p>
+            <w:r/>
+            <w:r>
+              <w:rPr>
+                <w:b/>
+                <w:color w:val="C0504D"/>
+                <w:sz w:val="20"/>
+              </w:rPr>
+              <w:t>0</w:t>
+            </w:r>
+          </w:p>
+        </w:tc>
+        <w:tc>
+          <w:tcPr>
+            <w:tcW w:type="dxa" w:w="1080"/>
+          </w:tcPr>
+          <w:p>
+            <w:r/>
+            <w:r>
+              <w:rPr>
+                <w:b/>
+                <w:color w:val="C0504D"/>
+                <w:sz w:val="20"/>
+              </w:rPr>
+              <w:t>SÍ</w:t>
+            </w:r>
+          </w:p>
+        </w:tc>
+      </w:tr>
+      <w:tr>
+        <w:tc>
+          <w:tcPr>
+            <w:tcW w:type="dxa" w:w="1080"/>
+          </w:tcPr>
+          <w:p>
+            <w:r/>
+            <w:r>
+              <w:rPr>
+                <w:b/>
+                <w:color w:val="C0504D"/>
+                <w:sz w:val="20"/>
+              </w:rPr>
+              <w:t>D</w:t>
+            </w:r>
+          </w:p>
+        </w:tc>
+        <w:tc>
+          <w:tcPr>
+            <w:tcW w:type="dxa" w:w="1080"/>
+          </w:tcPr>
+          <w:p>
+            <w:r/>
+            <w:r>
+              <w:rPr>
+                <w:b/>
+                <w:color w:val="C0504D"/>
+                <w:sz w:val="20"/>
+              </w:rPr>
+              <w:t>6</w:t>
+            </w:r>
+          </w:p>
+        </w:tc>
+        <w:tc>
+          <w:tcPr>
+            <w:tcW w:type="dxa" w:w="1080"/>
+          </w:tcPr>
+          <w:p>
+            <w:r/>
+            <w:r>
+              <w:rPr>
+                <w:b/>
+                <w:color w:val="C0504D"/>
+                <w:sz w:val="20"/>
+              </w:rPr>
+              <w:t>11</w:t>
+            </w:r>
+          </w:p>
+        </w:tc>
+        <w:tc>
+          <w:tcPr>
+            <w:tcW w:type="dxa" w:w="1080"/>
+          </w:tcPr>
+          <w:p>
+            <w:r/>
+            <w:r>
+              <w:rPr>
+                <w:b/>
+                <w:color w:val="C0504D"/>
+                <w:sz w:val="20"/>
+              </w:rPr>
+              <w:t>17</w:t>
+            </w:r>
+          </w:p>
+        </w:tc>
+        <w:tc>
+          <w:tcPr>
+            <w:tcW w:type="dxa" w:w="1080"/>
+          </w:tcPr>
+          <w:p>
+            <w:r/>
+            <w:r>
+              <w:rPr>
+                <w:b/>
+                <w:color w:val="C0504D"/>
+                <w:sz w:val="20"/>
+              </w:rPr>
+              <w:t>11</w:t>
+            </w:r>
+          </w:p>
+        </w:tc>
+        <w:tc>
+          <w:tcPr>
+            <w:tcW w:type="dxa" w:w="1080"/>
+          </w:tcPr>
+          <w:p>
+            <w:r/>
+            <w:r>
+              <w:rPr>
+                <w:b/>
+                <w:color w:val="C0504D"/>
+                <w:sz w:val="20"/>
+              </w:rPr>
+              <w:t>17</w:t>
+            </w:r>
+          </w:p>
+        </w:tc>
+        <w:tc>
+          <w:tcPr>
+            <w:tcW w:type="dxa" w:w="1080"/>
+          </w:tcPr>
+          <w:p>
+            <w:r/>
+            <w:r>
+              <w:rPr>
+                <w:b/>
+                <w:color w:val="C0504D"/>
+                <w:sz w:val="20"/>
+              </w:rPr>
+              <w:t>0</w:t>
+            </w:r>
+          </w:p>
+        </w:tc>
+        <w:tc>
+          <w:tcPr>
+            <w:tcW w:type="dxa" w:w="1080"/>
+          </w:tcPr>
+          <w:p>
+            <w:r/>
+            <w:r>
+              <w:rPr>
+                <w:b/>
+                <w:color w:val="C0504D"/>
+                <w:sz w:val="20"/>
+              </w:rPr>
+              <w:t>SÍ</w:t>
+            </w:r>
+          </w:p>
+        </w:tc>
+      </w:tr>
+      <w:tr>
+        <w:tc>
+          <w:tcPr>
+            <w:tcW w:type="dxa" w:w="1080"/>
+          </w:tcPr>
+          <w:p>
+            <w:r/>
+            <w:r>
+              <w:rPr>
+                <w:sz w:val="20"/>
+              </w:rPr>
+              <w:t>E</w:t>
+            </w:r>
+          </w:p>
+        </w:tc>
+        <w:tc>
+          <w:tcPr>
+            <w:tcW w:type="dxa" w:w="1080"/>
+          </w:tcPr>
+          <w:p>
+            <w:r/>
+            <w:r>
+              <w:rPr>
+                <w:sz w:val="20"/>
+              </w:rPr>
+              <w:t>7</w:t>
+            </w:r>
+          </w:p>
+        </w:tc>
+        <w:tc>
+          <w:tcPr>
+            <w:tcW w:type="dxa" w:w="1080"/>
+          </w:tcPr>
+          <w:p>
+            <w:r/>
+            <w:r>
+              <w:rPr>
+                <w:sz w:val="20"/>
+              </w:rPr>
+              <w:t>17</w:t>
+            </w:r>
+          </w:p>
+        </w:tc>
+        <w:tc>
+          <w:tcPr>
+            <w:tcW w:type="dxa" w:w="1080"/>
+          </w:tcPr>
+          <w:p>
+            <w:r/>
+            <w:r>
+              <w:rPr>
+                <w:sz w:val="20"/>
+              </w:rPr>
+              <w:t>24</w:t>
+            </w:r>
+          </w:p>
+        </w:tc>
+        <w:tc>
+          <w:tcPr>
+            <w:tcW w:type="dxa" w:w="1080"/>
+          </w:tcPr>
+          <w:p>
+            <w:r/>
+            <w:r>
+              <w:rPr>
+                <w:sz w:val="20"/>
+              </w:rPr>
+              <w:t>60</w:t>
+            </w:r>
+          </w:p>
+        </w:tc>
+        <w:tc>
+          <w:tcPr>
+            <w:tcW w:type="dxa" w:w="1080"/>
+          </w:tcPr>
+          <w:p>
+            <w:r/>
+            <w:r>
+              <w:rPr>
+                <w:sz w:val="20"/>
+              </w:rPr>
+              <w:t>67</w:t>
+            </w:r>
+          </w:p>
+        </w:tc>
+        <w:tc>
+          <w:tcPr>
+            <w:tcW w:type="dxa" w:w="1080"/>
+          </w:tcPr>
+          <w:p>
+            <w:r/>
+            <w:r>
+              <w:rPr>
+                <w:sz w:val="20"/>
+              </w:rPr>
+              <w:t>43</w:t>
+            </w:r>
+          </w:p>
+        </w:tc>
+        <w:tc>
+          <w:tcPr>
+            <w:tcW w:type="dxa" w:w="1080"/>
+          </w:tcPr>
+          <w:p>
+            <w:r/>
+            <w:r>
+              <w:rPr>
+                <w:sz w:val="20"/>
+              </w:rPr>
+              <w:t>No</w:t>
+            </w:r>
+          </w:p>
+        </w:tc>
+      </w:tr>
+      <w:tr>
+        <w:tc>
+          <w:tcPr>
+            <w:tcW w:type="dxa" w:w="1080"/>
+          </w:tcPr>
+          <w:p>
+            <w:r/>
+            <w:r>
+              <w:rPr>
+                <w:sz w:val="20"/>
+              </w:rPr>
+              <w:t>F</w:t>
+            </w:r>
+          </w:p>
+        </w:tc>
+        <w:tc>
+          <w:tcPr>
+            <w:tcW w:type="dxa" w:w="1080"/>
+          </w:tcPr>
+          <w:p>
+            <w:r/>
+            <w:r>
+              <w:rPr>
+                <w:sz w:val="20"/>
+              </w:rPr>
+              <w:t>8</w:t>
+            </w:r>
+          </w:p>
+        </w:tc>
+        <w:tc>
+          <w:tcPr>
+            <w:tcW w:type="dxa" w:w="1080"/>
+          </w:tcPr>
+          <w:p>
+            <w:r/>
+            <w:r>
+              <w:rPr>
+                <w:sz w:val="20"/>
+              </w:rPr>
+              <w:t>17</w:t>
+            </w:r>
+          </w:p>
+        </w:tc>
+        <w:tc>
+          <w:tcPr>
+            <w:tcW w:type="dxa" w:w="1080"/>
+          </w:tcPr>
+          <w:p>
+            <w:r/>
+            <w:r>
+              <w:rPr>
+                <w:sz w:val="20"/>
+              </w:rPr>
+              <w:t>25</w:t>
+            </w:r>
+          </w:p>
+        </w:tc>
+        <w:tc>
+          <w:tcPr>
+            <w:tcW w:type="dxa" w:w="1080"/>
+          </w:tcPr>
+          <w:p>
+            <w:r/>
+            <w:r>
+              <w:rPr>
+                <w:sz w:val="20"/>
+              </w:rPr>
+              <w:t>33</w:t>
+            </w:r>
+          </w:p>
+        </w:tc>
+        <w:tc>
+          <w:tcPr>
+            <w:tcW w:type="dxa" w:w="1080"/>
+          </w:tcPr>
+          <w:p>
+            <w:r/>
+            <w:r>
+              <w:rPr>
+                <w:sz w:val="20"/>
+              </w:rPr>
+              <w:t>41</w:t>
+            </w:r>
+          </w:p>
+        </w:tc>
+        <w:tc>
+          <w:tcPr>
+            <w:tcW w:type="dxa" w:w="1080"/>
+          </w:tcPr>
+          <w:p>
+            <w:r/>
+            <w:r>
+              <w:rPr>
+                <w:sz w:val="20"/>
+              </w:rPr>
+              <w:t>16</w:t>
+            </w:r>
+          </w:p>
+        </w:tc>
+        <w:tc>
+          <w:tcPr>
+            <w:tcW w:type="dxa" w:w="1080"/>
+          </w:tcPr>
+          <w:p>
+            <w:r/>
+            <w:r>
+              <w:rPr>
+                <w:sz w:val="20"/>
+              </w:rPr>
+              <w:t>No</w:t>
+            </w:r>
+          </w:p>
+        </w:tc>
+      </w:tr>
+      <w:tr>
+        <w:tc>
+          <w:tcPr>
+            <w:tcW w:type="dxa" w:w="1080"/>
+          </w:tcPr>
+          <w:p>
+            <w:r/>
+            <w:r>
+              <w:rPr>
+                <w:b/>
+                <w:color w:val="C0504D"/>
+                <w:sz w:val="20"/>
+              </w:rPr>
+              <w:t>G</w:t>
+            </w:r>
+          </w:p>
+        </w:tc>
+        <w:tc>
+          <w:tcPr>
+            <w:tcW w:type="dxa" w:w="1080"/>
+          </w:tcPr>
+          <w:p>
+            <w:r/>
+            <w:r>
+              <w:rPr>
+                <w:b/>
+                <w:color w:val="C0504D"/>
+                <w:sz w:val="20"/>
+              </w:rPr>
+              <w:t>10</w:t>
+            </w:r>
+          </w:p>
+        </w:tc>
+        <w:tc>
+          <w:tcPr>
+            <w:tcW w:type="dxa" w:w="1080"/>
+          </w:tcPr>
+          <w:p>
+            <w:r/>
+            <w:r>
+              <w:rPr>
+                <w:b/>
+                <w:color w:val="C0504D"/>
+                <w:sz w:val="20"/>
+              </w:rPr>
+              <w:t>17</w:t>
+            </w:r>
+          </w:p>
+        </w:tc>
+        <w:tc>
+          <w:tcPr>
+            <w:tcW w:type="dxa" w:w="1080"/>
+          </w:tcPr>
+          <w:p>
+            <w:r/>
+            <w:r>
+              <w:rPr>
+                <w:b/>
+                <w:color w:val="C0504D"/>
+                <w:sz w:val="20"/>
+              </w:rPr>
+              <w:t>27</w:t>
+            </w:r>
+          </w:p>
+        </w:tc>
+        <w:tc>
+          <w:tcPr>
+            <w:tcW w:type="dxa" w:w="1080"/>
+          </w:tcPr>
+          <w:p>
+            <w:r/>
+            <w:r>
+              <w:rPr>
+                <w:b/>
+                <w:color w:val="C0504D"/>
+                <w:sz w:val="20"/>
+              </w:rPr>
+              <w:t>17</w:t>
+            </w:r>
+          </w:p>
+        </w:tc>
+        <w:tc>
+          <w:tcPr>
+            <w:tcW w:type="dxa" w:w="1080"/>
+          </w:tcPr>
+          <w:p>
+            <w:r/>
+            <w:r>
+              <w:rPr>
+                <w:b/>
+                <w:color w:val="C0504D"/>
+                <w:sz w:val="20"/>
+              </w:rPr>
+              <w:t>27</w:t>
+            </w:r>
+          </w:p>
+        </w:tc>
+        <w:tc>
+          <w:tcPr>
+            <w:tcW w:type="dxa" w:w="1080"/>
+          </w:tcPr>
+          <w:p>
+            <w:r/>
+            <w:r>
+              <w:rPr>
+                <w:b/>
+                <w:color w:val="C0504D"/>
+                <w:sz w:val="20"/>
+              </w:rPr>
+              <w:t>0</w:t>
+            </w:r>
+          </w:p>
+        </w:tc>
+        <w:tc>
+          <w:tcPr>
+            <w:tcW w:type="dxa" w:w="1080"/>
+          </w:tcPr>
+          <w:p>
+            <w:r/>
+            <w:r>
+              <w:rPr>
+                <w:b/>
+                <w:color w:val="C0504D"/>
+                <w:sz w:val="20"/>
+              </w:rPr>
+              <w:t>SÍ</w:t>
+            </w:r>
+          </w:p>
+        </w:tc>
+      </w:tr>
+      <w:tr>
+        <w:tc>
+          <w:tcPr>
+            <w:tcW w:type="dxa" w:w="1080"/>
+          </w:tcPr>
+          <w:p>
+            <w:r/>
+            <w:r>
+              <w:rPr>
+                <w:b/>
+                <w:color w:val="C0504D"/>
+                <w:sz w:val="20"/>
+              </w:rPr>
+              <w:t>H</w:t>
+            </w:r>
+          </w:p>
+        </w:tc>
+        <w:tc>
+          <w:tcPr>
+            <w:tcW w:type="dxa" w:w="1080"/>
+          </w:tcPr>
+          <w:p>
+            <w:r/>
+            <w:r>
+              <w:rPr>
+                <w:b/>
+                <w:color w:val="C0504D"/>
+                <w:sz w:val="20"/>
+              </w:rPr>
+              <w:t>14</w:t>
+            </w:r>
+          </w:p>
+        </w:tc>
+        <w:tc>
+          <w:tcPr>
+            <w:tcW w:type="dxa" w:w="1080"/>
+          </w:tcPr>
+          <w:p>
+            <w:r/>
+            <w:r>
+              <w:rPr>
+                <w:b/>
+                <w:color w:val="C0504D"/>
+                <w:sz w:val="20"/>
+              </w:rPr>
+              <w:t>27</w:t>
+            </w:r>
+          </w:p>
+        </w:tc>
+        <w:tc>
+          <w:tcPr>
+            <w:tcW w:type="dxa" w:w="1080"/>
+          </w:tcPr>
+          <w:p>
+            <w:r/>
+            <w:r>
+              <w:rPr>
+                <w:b/>
+                <w:color w:val="C0504D"/>
+                <w:sz w:val="20"/>
+              </w:rPr>
+              <w:t>41</w:t>
+            </w:r>
+          </w:p>
+        </w:tc>
+        <w:tc>
+          <w:tcPr>
+            <w:tcW w:type="dxa" w:w="1080"/>
+          </w:tcPr>
+          <w:p>
+            <w:r/>
+            <w:r>
+              <w:rPr>
+                <w:b/>
+                <w:color w:val="C0504D"/>
+                <w:sz w:val="20"/>
+              </w:rPr>
+              <w:t>27</w:t>
+            </w:r>
+          </w:p>
+        </w:tc>
+        <w:tc>
+          <w:tcPr>
+            <w:tcW w:type="dxa" w:w="1080"/>
+          </w:tcPr>
+          <w:p>
+            <w:r/>
+            <w:r>
+              <w:rPr>
+                <w:b/>
+                <w:color w:val="C0504D"/>
+                <w:sz w:val="20"/>
+              </w:rPr>
+              <w:t>41</w:t>
+            </w:r>
+          </w:p>
+        </w:tc>
+        <w:tc>
+          <w:tcPr>
+            <w:tcW w:type="dxa" w:w="1080"/>
+          </w:tcPr>
+          <w:p>
+            <w:r/>
+            <w:r>
+              <w:rPr>
+                <w:b/>
+                <w:color w:val="C0504D"/>
+                <w:sz w:val="20"/>
+              </w:rPr>
+              <w:t>0</w:t>
+            </w:r>
+          </w:p>
+        </w:tc>
+        <w:tc>
+          <w:tcPr>
+            <w:tcW w:type="dxa" w:w="1080"/>
+          </w:tcPr>
+          <w:p>
+            <w:r/>
+            <w:r>
+              <w:rPr>
+                <w:b/>
+                <w:color w:val="C0504D"/>
+                <w:sz w:val="20"/>
+              </w:rPr>
+              <w:t>SÍ</w:t>
+            </w:r>
+          </w:p>
+        </w:tc>
+      </w:tr>
+      <w:tr>
+        <w:tc>
+          <w:tcPr>
+            <w:tcW w:type="dxa" w:w="1080"/>
+          </w:tcPr>
+          <w:p>
+            <w:r/>
+            <w:r>
+              <w:rPr>
+                <w:b/>
+                <w:color w:val="C0504D"/>
+                <w:sz w:val="20"/>
+              </w:rPr>
+              <w:t>I</w:t>
+            </w:r>
+          </w:p>
+        </w:tc>
+        <w:tc>
+          <w:tcPr>
+            <w:tcW w:type="dxa" w:w="1080"/>
+          </w:tcPr>
+          <w:p>
+            <w:r/>
+            <w:r>
+              <w:rPr>
+                <w:b/>
+                <w:color w:val="C0504D"/>
+                <w:sz w:val="20"/>
+              </w:rPr>
+              <w:t>12</w:t>
+            </w:r>
+          </w:p>
+        </w:tc>
+        <w:tc>
+          <w:tcPr>
+            <w:tcW w:type="dxa" w:w="1080"/>
+          </w:tcPr>
+          <w:p>
+            <w:r/>
+            <w:r>
+              <w:rPr>
+                <w:b/>
+                <w:color w:val="C0504D"/>
+                <w:sz w:val="20"/>
+              </w:rPr>
+              <w:t>41</w:t>
+            </w:r>
+          </w:p>
+        </w:tc>
+        <w:tc>
+          <w:tcPr>
+            <w:tcW w:type="dxa" w:w="1080"/>
+          </w:tcPr>
+          <w:p>
+            <w:r/>
+            <w:r>
+              <w:rPr>
+                <w:b/>
+                <w:color w:val="C0504D"/>
+                <w:sz w:val="20"/>
+              </w:rPr>
+              <w:t>53</w:t>
+            </w:r>
+          </w:p>
+        </w:tc>
+        <w:tc>
+          <w:tcPr>
+            <w:tcW w:type="dxa" w:w="1080"/>
+          </w:tcPr>
+          <w:p>
+            <w:r/>
+            <w:r>
+              <w:rPr>
+                <w:b/>
+                <w:color w:val="C0504D"/>
+                <w:sz w:val="20"/>
+              </w:rPr>
+              <w:t>41</w:t>
+            </w:r>
+          </w:p>
+        </w:tc>
+        <w:tc>
+          <w:tcPr>
+            <w:tcW w:type="dxa" w:w="1080"/>
+          </w:tcPr>
+          <w:p>
+            <w:r/>
+            <w:r>
+              <w:rPr>
+                <w:b/>
+                <w:color w:val="C0504D"/>
+                <w:sz w:val="20"/>
+              </w:rPr>
+              <w:t>53</w:t>
+            </w:r>
+          </w:p>
+        </w:tc>
+        <w:tc>
+          <w:tcPr>
+            <w:tcW w:type="dxa" w:w="1080"/>
+          </w:tcPr>
+          <w:p>
+            <w:r/>
+            <w:r>
+              <w:rPr>
+                <w:b/>
+                <w:color w:val="C0504D"/>
+                <w:sz w:val="20"/>
+              </w:rPr>
+              <w:t>0</w:t>
+            </w:r>
+          </w:p>
+        </w:tc>
+        <w:tc>
+          <w:tcPr>
+            <w:tcW w:type="dxa" w:w="1080"/>
+          </w:tcPr>
+          <w:p>
+            <w:r/>
+            <w:r>
+              <w:rPr>
+                <w:b/>
+                <w:color w:val="C0504D"/>
+                <w:sz w:val="20"/>
+              </w:rPr>
+              <w:t>SÍ</w:t>
+            </w:r>
+          </w:p>
+        </w:tc>
+      </w:tr>
+      <w:tr>
+        <w:tc>
+          <w:tcPr>
+            <w:tcW w:type="dxa" w:w="1080"/>
+          </w:tcPr>
+          <w:p>
+            <w:r/>
+            <w:r>
+              <w:rPr>
+                <w:b/>
+                <w:color w:val="C0504D"/>
+                <w:sz w:val="20"/>
+              </w:rPr>
+              <w:t>J</w:t>
+            </w:r>
+          </w:p>
+        </w:tc>
+        <w:tc>
+          <w:tcPr>
+            <w:tcW w:type="dxa" w:w="1080"/>
+          </w:tcPr>
+          <w:p>
+            <w:r/>
+            <w:r>
+              <w:rPr>
+                <w:b/>
+                <w:color w:val="C0504D"/>
+                <w:sz w:val="20"/>
+              </w:rPr>
+              <w:t>14</w:t>
+            </w:r>
+          </w:p>
+        </w:tc>
+        <w:tc>
+          <w:tcPr>
+            <w:tcW w:type="dxa" w:w="1080"/>
+          </w:tcPr>
+          <w:p>
+            <w:r/>
+            <w:r>
+              <w:rPr>
+                <w:b/>
+                <w:color w:val="C0504D"/>
+                <w:sz w:val="20"/>
+              </w:rPr>
+              <w:t>53</w:t>
+            </w:r>
+          </w:p>
+        </w:tc>
+        <w:tc>
+          <w:tcPr>
+            <w:tcW w:type="dxa" w:w="1080"/>
+          </w:tcPr>
+          <w:p>
+            <w:r/>
+            <w:r>
+              <w:rPr>
+                <w:b/>
+                <w:color w:val="C0504D"/>
+                <w:sz w:val="20"/>
+              </w:rPr>
+              <w:t>67</w:t>
+            </w:r>
+          </w:p>
+        </w:tc>
+        <w:tc>
+          <w:tcPr>
+            <w:tcW w:type="dxa" w:w="1080"/>
+          </w:tcPr>
+          <w:p>
+            <w:r/>
+            <w:r>
+              <w:rPr>
+                <w:b/>
+                <w:color w:val="C0504D"/>
+                <w:sz w:val="20"/>
+              </w:rPr>
+              <w:t>53</w:t>
+            </w:r>
+          </w:p>
+        </w:tc>
+        <w:tc>
+          <w:tcPr>
+            <w:tcW w:type="dxa" w:w="1080"/>
+          </w:tcPr>
+          <w:p>
+            <w:r/>
+            <w:r>
+              <w:rPr>
+                <w:b/>
+                <w:color w:val="C0504D"/>
+                <w:sz w:val="20"/>
+              </w:rPr>
+              <w:t>67</w:t>
+            </w:r>
+          </w:p>
+        </w:tc>
+        <w:tc>
+          <w:tcPr>
+            <w:tcW w:type="dxa" w:w="1080"/>
+          </w:tcPr>
+          <w:p>
+            <w:r/>
+            <w:r>
+              <w:rPr>
+                <w:b/>
+                <w:color w:val="C0504D"/>
+                <w:sz w:val="20"/>
+              </w:rPr>
+              <w:t>0</w:t>
+            </w:r>
+          </w:p>
+        </w:tc>
+        <w:tc>
+          <w:tcPr>
+            <w:tcW w:type="dxa" w:w="1080"/>
+          </w:tcPr>
+          <w:p>
+            <w:r/>
+            <w:r>
+              <w:rPr>
+                <w:b/>
+                <w:color w:val="C0504D"/>
+                <w:sz w:val="20"/>
+              </w:rPr>
+              <w:t>SÍ</w:t>
+            </w:r>
+          </w:p>
+        </w:tc>
+      </w:tr>
+      <w:tr>
+        <w:tc>
+          <w:tcPr>
+            <w:tcW w:type="dxa" w:w="1080"/>
+          </w:tcPr>
+          <w:p>
+            <w:r/>
+            <w:r>
+              <w:rPr>
+                <w:sz w:val="20"/>
+              </w:rPr>
+              <w:t>K</w:t>
+            </w:r>
+          </w:p>
+        </w:tc>
+        <w:tc>
+          <w:tcPr>
+            <w:tcW w:type="dxa" w:w="1080"/>
+          </w:tcPr>
+          <w:p>
+            <w:r/>
+            <w:r>
+              <w:rPr>
+                <w:sz w:val="20"/>
+              </w:rPr>
+              <w:t>6</w:t>
+            </w:r>
+          </w:p>
+        </w:tc>
+        <w:tc>
+          <w:tcPr>
+            <w:tcW w:type="dxa" w:w="1080"/>
+          </w:tcPr>
+          <w:p>
+            <w:r/>
+            <w:r>
+              <w:rPr>
+                <w:sz w:val="20"/>
+              </w:rPr>
+              <w:t>53</w:t>
+            </w:r>
+          </w:p>
+        </w:tc>
+        <w:tc>
+          <w:tcPr>
+            <w:tcW w:type="dxa" w:w="1080"/>
+          </w:tcPr>
+          <w:p>
+            <w:r/>
+            <w:r>
+              <w:rPr>
+                <w:sz w:val="20"/>
+              </w:rPr>
+              <w:t>59</w:t>
+            </w:r>
+          </w:p>
+        </w:tc>
+        <w:tc>
+          <w:tcPr>
+            <w:tcW w:type="dxa" w:w="1080"/>
+          </w:tcPr>
+          <w:p>
+            <w:r/>
+            <w:r>
+              <w:rPr>
+                <w:sz w:val="20"/>
+              </w:rPr>
+              <w:t>61</w:t>
+            </w:r>
+          </w:p>
+        </w:tc>
+        <w:tc>
+          <w:tcPr>
+            <w:tcW w:type="dxa" w:w="1080"/>
+          </w:tcPr>
+          <w:p>
+            <w:r/>
+            <w:r>
+              <w:rPr>
+                <w:sz w:val="20"/>
+              </w:rPr>
+              <w:t>67</w:t>
+            </w:r>
+          </w:p>
+        </w:tc>
+        <w:tc>
+          <w:tcPr>
+            <w:tcW w:type="dxa" w:w="1080"/>
+          </w:tcPr>
+          <w:p>
+            <w:r/>
+            <w:r>
+              <w:rPr>
+                <w:sz w:val="20"/>
+              </w:rPr>
+              <w:t>8</w:t>
+            </w:r>
+          </w:p>
+        </w:tc>
+        <w:tc>
+          <w:tcPr>
+            <w:tcW w:type="dxa" w:w="1080"/>
+          </w:tcPr>
+          <w:p>
+            <w:r/>
+            <w:r>
+              <w:rPr>
+                <w:sz w:val="20"/>
+              </w:rPr>
+              <w:t>No</w:t>
+            </w:r>
+          </w:p>
+        </w:tc>
+      </w:tr>
+      <w:tr>
+        <w:tc>
+          <w:tcPr>
+            <w:tcW w:type="dxa" w:w="1080"/>
+          </w:tcPr>
+          <w:p>
+            <w:r/>
+            <w:r>
+              <w:rPr>
+                <w:b/>
+                <w:color w:val="C0504D"/>
+                <w:sz w:val="20"/>
+              </w:rPr>
+              <w:t>L</w:t>
+            </w:r>
+          </w:p>
+        </w:tc>
+        <w:tc>
+          <w:tcPr>
+            <w:tcW w:type="dxa" w:w="1080"/>
+          </w:tcPr>
+          <w:p>
+            <w:r/>
+            <w:r>
+              <w:rPr>
+                <w:b/>
+                <w:color w:val="C0504D"/>
+                <w:sz w:val="20"/>
+              </w:rPr>
+              <w:t>6</w:t>
+            </w:r>
+          </w:p>
+        </w:tc>
+        <w:tc>
+          <w:tcPr>
+            <w:tcW w:type="dxa" w:w="1080"/>
+          </w:tcPr>
+          <w:p>
+            <w:r/>
+            <w:r>
+              <w:rPr>
+                <w:b/>
+                <w:color w:val="C0504D"/>
+                <w:sz w:val="20"/>
+              </w:rPr>
+              <w:t>67</w:t>
+            </w:r>
+          </w:p>
+        </w:tc>
+        <w:tc>
+          <w:tcPr>
+            <w:tcW w:type="dxa" w:w="1080"/>
+          </w:tcPr>
+          <w:p>
+            <w:r/>
+            <w:r>
+              <w:rPr>
+                <w:b/>
+                <w:color w:val="C0504D"/>
+                <w:sz w:val="20"/>
+              </w:rPr>
+              <w:t>73</w:t>
+            </w:r>
+          </w:p>
+        </w:tc>
+        <w:tc>
+          <w:tcPr>
+            <w:tcW w:type="dxa" w:w="1080"/>
+          </w:tcPr>
+          <w:p>
+            <w:r/>
+            <w:r>
+              <w:rPr>
+                <w:b/>
+                <w:color w:val="C0504D"/>
+                <w:sz w:val="20"/>
+              </w:rPr>
+              <w:t>67</w:t>
+            </w:r>
+          </w:p>
+        </w:tc>
+        <w:tc>
+          <w:tcPr>
+            <w:tcW w:type="dxa" w:w="1080"/>
+          </w:tcPr>
+          <w:p>
+            <w:r/>
+            <w:r>
+              <w:rPr>
+                <w:b/>
+                <w:color w:val="C0504D"/>
+                <w:sz w:val="20"/>
+              </w:rPr>
+              <w:t>73</w:t>
+            </w:r>
+          </w:p>
+        </w:tc>
+        <w:tc>
+          <w:tcPr>
+            <w:tcW w:type="dxa" w:w="1080"/>
+          </w:tcPr>
+          <w:p>
+            <w:r/>
+            <w:r>
+              <w:rPr>
+                <w:b/>
+                <w:color w:val="C0504D"/>
+                <w:sz w:val="20"/>
+              </w:rPr>
+              <w:t>0</w:t>
+            </w:r>
+          </w:p>
+        </w:tc>
+        <w:tc>
+          <w:tcPr>
+            <w:tcW w:type="dxa" w:w="1080"/>
+          </w:tcPr>
+          <w:p>
+            <w:r/>
+            <w:r>
+              <w:rPr>
+                <w:b/>
+                <w:color w:val="C0504D"/>
+                <w:sz w:val="20"/>
+              </w:rPr>
+              <w:t>SÍ</w:t>
+            </w:r>
+          </w:p>
+        </w:tc>
+      </w:tr>
+    </w:tbl>
+    <w:p>
+      <w:r>
+        <w:rPr>
+          <w:b/>
+          <w:i w:val="0"/>
+        </w:rPr>
+        <w:t>Duración total del proyecto: 73 días.</w:t>
+      </w:r>
+    </w:p>
+    <w:p/>
+    <w:p>
+      <w:pPr>
+        <w:pStyle w:val="Heading2"/>
+      </w:pPr>
+      <w:r>
+        <w:t>Opción (c) — Tint con costo ÓPTIMO</w:t>
       </w:r>
     </w:p>
     <w:p>

</xml_diff>